<commit_message>
Fixed date and minor typo.
</commit_message>
<xml_diff>
--- a/CrequeDesignAndDiagram.docx
+++ b/CrequeDesignAndDiagram.docx
@@ -24,7 +24,21 @@
           <w:sz w:val="22"/>
           <w:szCs w:val="22"/>
         </w:rPr>
-        <w:t>: 4/29/2026</w:t>
+        <w:t>: 4/2</w:t>
+      </w:r>
+      <w:r>
+        <w:rPr>
+          <w:sz w:val="22"/>
+          <w:szCs w:val="22"/>
+        </w:rPr>
+        <w:t>8/</w:t>
+      </w:r>
+      <w:r>
+        <w:rPr>
+          <w:sz w:val="22"/>
+          <w:szCs w:val="22"/>
+        </w:rPr>
+        <w:t>2026</w:t>
       </w:r>
       <w:r>
         <w:rPr>
@@ -121,6 +135,8 @@
       <w:pPr>
         <w:spacing w:after="0"/>
         <w:rPr>
+          <w:b/>
+          <w:bCs/>
           <w:sz w:val="22"/>
           <w:szCs w:val="22"/>
           <w:u w:val="single"/>
@@ -128,6 +144,8 @@
       </w:pPr>
       <w:r>
         <w:rPr>
+          <w:b/>
+          <w:bCs/>
           <w:sz w:val="22"/>
           <w:szCs w:val="22"/>
           <w:u w:val="single"/>
@@ -136,6 +154,8 @@
       </w:r>
       <w:r>
         <w:rPr>
+          <w:b/>
+          <w:bCs/>
           <w:sz w:val="22"/>
           <w:szCs w:val="22"/>
           <w:u w:val="single"/>
@@ -144,6 +164,8 @@
       </w:r>
       <w:r>
         <w:rPr>
+          <w:b/>
+          <w:bCs/>
           <w:sz w:val="22"/>
           <w:szCs w:val="22"/>
           <w:u w:val="single"/>
@@ -297,14 +319,14 @@
           <w:sz w:val="22"/>
           <w:szCs w:val="22"/>
         </w:rPr>
-        <w:t>acquisition,</w:t>
-      </w:r>
-      <w:r>
-        <w:rPr>
-          <w:sz w:val="22"/>
-          <w:szCs w:val="22"/>
-        </w:rPr>
-        <w:t xml:space="preserve"> so </w:t>
+        <w:t>acquisition</w:t>
+      </w:r>
+      <w:r>
+        <w:rPr>
+          <w:sz w:val="22"/>
+          <w:szCs w:val="22"/>
+        </w:rPr>
+        <w:t xml:space="preserve"> </w:t>
       </w:r>
       <w:r>
         <w:rPr>
@@ -339,6 +361,8 @@
       <w:pPr>
         <w:spacing w:after="0"/>
         <w:rPr>
+          <w:b/>
+          <w:bCs/>
           <w:sz w:val="22"/>
           <w:szCs w:val="22"/>
           <w:u w:val="single"/>
@@ -346,6 +370,8 @@
       </w:pPr>
       <w:r>
         <w:rPr>
+          <w:b/>
+          <w:bCs/>
           <w:sz w:val="22"/>
           <w:szCs w:val="22"/>
           <w:u w:val="single"/>
@@ -354,6 +380,8 @@
       </w:r>
       <w:r>
         <w:rPr>
+          <w:b/>
+          <w:bCs/>
           <w:sz w:val="22"/>
           <w:szCs w:val="22"/>
           <w:u w:val="single"/>
@@ -362,6 +390,8 @@
       </w:r>
       <w:r>
         <w:rPr>
+          <w:b/>
+          <w:bCs/>
           <w:sz w:val="22"/>
           <w:szCs w:val="22"/>
           <w:u w:val="single"/>
@@ -370,6 +400,8 @@
       </w:r>
       <w:r>
         <w:rPr>
+          <w:b/>
+          <w:bCs/>
           <w:sz w:val="22"/>
           <w:szCs w:val="22"/>
           <w:u w:val="single"/>
@@ -378,6 +410,8 @@
       </w:r>
       <w:r>
         <w:rPr>
+          <w:b/>
+          <w:bCs/>
           <w:sz w:val="22"/>
           <w:szCs w:val="22"/>
           <w:u w:val="single"/>
@@ -834,7 +868,7 @@
           <w:szCs w:val="22"/>
         </w:rPr>
         <w:drawing>
-          <wp:anchor distT="0" distB="0" distL="114300" distR="114300" simplePos="0" relativeHeight="251658240" behindDoc="0" locked="0" layoutInCell="1" allowOverlap="1" wp14:anchorId="3A00592E" wp14:editId="34D27032">
+          <wp:anchor distT="0" distB="0" distL="114300" distR="114300" simplePos="0" relativeHeight="251658240" behindDoc="0" locked="0" layoutInCell="1" allowOverlap="1" wp14:anchorId="3A00592E" wp14:editId="1F50700B">
             <wp:simplePos x="0" y="0"/>
             <wp:positionH relativeFrom="column">
               <wp:posOffset>419100</wp:posOffset>

</xml_diff>